<commit_message>
İkinci rapora süre ve token karşılaştırmasını ekle
</commit_message>
<xml_diff>
--- a/Haftalık Raporlar/Rapor-2.docx
+++ b/Haftalık Raporlar/Rapor-2.docx
@@ -14,8 +14,6 @@
       <w:pPr>
         <w:pStyle w:val="34"/>
       </w:pPr>
-      <w:bookmarkStart w:id="0" w:name="_GoBack"/>
-      <w:bookmarkEnd w:id="0"/>
       <w:r>
         <w:t>Haftalık Çalışma Raporu</w:t>
       </w:r>
@@ -52,8 +50,8 @@
         </w:tblCellMar>
       </w:tblPr>
       <w:tblGrid>
-        <w:gridCol w:w="4123"/>
-        <w:gridCol w:w="5662"/>
+        <w:gridCol w:w="4134"/>
+        <w:gridCol w:w="5651"/>
       </w:tblGrid>
       <w:tr>
         <w:tblPrEx>
@@ -264,15 +262,8 @@
             <w:vAlign w:val="center"/>
           </w:tcPr>
           <w:p>
-            <w:pPr>
-              <w:spacing w:after="40" w:line="240" w:lineRule="auto"/>
-            </w:pPr>
             <w:r>
-              <w:rPr>
-                <w:b w:val="0"/>
-                <w:sz w:val="20"/>
-              </w:rPr>
-              <w:t>Gemini bağlantısı ve kart bağlamı seçimi çalışıyor; A/B/C karşılaştırmasının sonuçları henüz raporlanmadı.</w:t>
+              <w:t>Gemini ve kart bağlamı seçimi çalışıyor; eski A/B/C ölçümleri eklendi, güncel karşılaştırma açık.</w:t>
             </w:r>
           </w:p>
         </w:tc>
@@ -500,6 +491,7 @@
     <w:p>
       <w:pPr>
         <w:pStyle w:val="2"/>
+        <w:spacing w:before="140"/>
       </w:pPr>
       <w:r>
         <w:t>Tamamladığımız işler</w:t>
@@ -556,7 +548,7 @@
     </w:p>
     <w:p>
       <w:r>
-        <w:t>Kaynak bağlamının etkisini incelemek için A/B/C karşılaştırmasını mobil üretim formuna bağladık. A kolunda seçilen kartların tam içeriği verilmezken B kolunda seçilen kartlar, C kolunda bütün kart belgesi veriliyor. Ortak görev ve güvenlik yönergeleri A kolunda da bulunabiliyor. Karşılaştırma altyapısını hazırladık; ancak aynı girdilerle alınan gerçek çıktıları ve süreleri içeren tamamlanmış bir değerlendirme henüz oluşturmadık. Bu nedenle RAG’in senaryoları iyileştirdiğini şimdilik sonuç olarak yazmıyoruz.</w:t>
+        <w:t>Kaynak bağlamının etkisini incelemek için A/B/C karşılaştırmasını mobil üretim formuna bağladık. Güncel normal üretim de seçilen davranış kartlarının tam metnini kullanıyor; dolayısıyla kart metnini almayan A kolu normal üretim düğmesiyle aynı değil. B kolu seçilen kartları, C kolu bütün kart belgesini alıyor. Güncel akış için aynı girdilerle tamamlanmış bir kalite ve süre değerlendirmemiz henüz yok. 23 Ekim’deki eski prototipe ait üç ölçümü süre ve token tablosuyla raporun sonundaki karşılaştırma bölümünde ayrıca gösterdik.</w:t>
       </w:r>
     </w:p>
     <w:p>
@@ -670,6 +662,1269 @@
     <w:p>
       <w:r>
         <w:t>Öncelikle sunucuya doğrudan erişimi ve HTTPS’i tamamlayıp son mobil yapılandırmayı test edeceğiz. Aynı girdilerle A/B/C çıktıları, yanıt süreleri ve içerik sorunlarını kaydederek kaynak bağlamının etkisini değerlendireceğiz. Güncellenen D01 zamanlama kuralıyla gerçek klip planını tekrar üretecek, D02 oynatmasını ve videoların sahne sürekliliğini kontrol edeceğiz. Ayrı yürütülen sese tepki analizi çalışmasının yöntem ve sonuçlarını ortak kayda aktararak mobil bağlantısına ilerleyeceğiz. Literatür klasörü, sunucunun yeniden başlaması ve yedekten geri yükleme kontrolleri de sonraki çalışmalarımız arasında.</w:t>
+      </w:r>
+    </w:p>
+    <w:p>
+      <w:r>
+        <w:br w:type="page"/>
+      </w:r>
+    </w:p>
+    <w:p>
+      <w:pPr>
+        <w:pStyle w:val="2"/>
+      </w:pPr>
+      <w:r>
+        <w:t>Senaryo üretiminde bağlam süre ve token karşılaştırması</w:t>
+      </w:r>
+    </w:p>
+    <w:p>
+      <w:r>
+        <w:t>Normal üretim ile RAG arasındaki farkı değerlendirmek için önce uygulamadaki üretim yollarını ayırdık. Güncel normal üretimde seçilen davranış kartlarının kuralları ve tam metni zaten isteme ekleniyor. Bu nedenle normal üretimi kaynaksız bir model çağrısı olarak değerlendirmiyoruz. A/B/C düzeni, aynı model ve üretim ayarlarıyla farklı miktarda kart bağlamını karşılaştırmak için hazırlandı.</w:t>
+      </w:r>
+    </w:p>
+    <w:p>
+      <w:pPr>
+        <w:pStyle w:val="3"/>
+      </w:pPr>
+      <w:r>
+        <w:t>Güncel üretim yollarının farkı</w:t>
+      </w:r>
+    </w:p>
+    <w:tbl>
+      <w:tblPr>
+        <w:tblStyle w:val="12"/>
+        <w:tblW w:w="0" w:type="auto"/>
+        <w:jc w:val="center"/>
+        <w:tblLayout w:type="autofit"/>
+        <w:tblCellMar>
+          <w:top w:w="0" w:type="dxa"/>
+          <w:left w:w="108" w:type="dxa"/>
+          <w:bottom w:w="0" w:type="dxa"/>
+          <w:right w:w="108" w:type="dxa"/>
+        </w:tblCellMar>
+      </w:tblPr>
+      <w:tblGrid>
+        <w:gridCol w:w="3768"/>
+        <w:gridCol w:w="5997"/>
+      </w:tblGrid>
+      <w:tr>
+        <w:tblPrEx>
+          <w:tblCellMar>
+            <w:top w:w="0" w:type="dxa"/>
+            <w:left w:w="108" w:type="dxa"/>
+            <w:bottom w:w="0" w:type="dxa"/>
+            <w:right w:w="108" w:type="dxa"/>
+          </w:tblCellMar>
+        </w:tblPrEx>
+        <w:trPr>
+          <w:tblHeader/>
+          <w:jc w:val="center"/>
+        </w:trPr>
+        <w:tc>
+          <w:tcPr>
+            <w:tcW w:w="4802" w:type="dxa"/>
+            <w:tcBorders>
+              <w:top w:val="single" w:color="D9D9D9" w:sz="4" w:space="0"/>
+              <w:left w:val="single" w:color="D9D9D9" w:sz="4" w:space="0"/>
+              <w:bottom w:val="single" w:color="D9D9D9" w:sz="4" w:space="0"/>
+              <w:right w:val="single" w:color="D9D9D9" w:sz="4" w:space="0"/>
+            </w:tcBorders>
+            <w:shd w:val="clear" w:color="auto" w:fill="E8EDF2"/>
+            <w:tcMar>
+              <w:top w:w="80" w:type="dxa"/>
+              <w:left w:w="80" w:type="dxa"/>
+              <w:bottom w:w="80" w:type="dxa"/>
+              <w:right w:w="80" w:type="dxa"/>
+            </w:tcMar>
+            <w:vAlign w:val="center"/>
+          </w:tcPr>
+          <w:p>
+            <w:pPr>
+              <w:spacing w:after="40" w:line="240" w:lineRule="auto"/>
+            </w:pPr>
+            <w:r>
+              <w:rPr>
+                <w:b/>
+                <w:sz w:val="20"/>
+              </w:rPr>
+              <w:t>Üretim yolu</w:t>
+            </w:r>
+          </w:p>
+        </w:tc>
+        <w:tc>
+          <w:tcPr>
+            <w:tcW w:w="4802" w:type="dxa"/>
+            <w:tcBorders>
+              <w:top w:val="single" w:color="D9D9D9" w:sz="4" w:space="0"/>
+              <w:left w:val="single" w:color="D9D9D9" w:sz="4" w:space="0"/>
+              <w:bottom w:val="single" w:color="D9D9D9" w:sz="4" w:space="0"/>
+              <w:right w:val="single" w:color="D9D9D9" w:sz="4" w:space="0"/>
+            </w:tcBorders>
+            <w:shd w:val="clear" w:color="auto" w:fill="E8EDF2"/>
+            <w:tcMar>
+              <w:top w:w="80" w:type="dxa"/>
+              <w:left w:w="80" w:type="dxa"/>
+              <w:bottom w:w="80" w:type="dxa"/>
+              <w:right w:w="80" w:type="dxa"/>
+            </w:tcMar>
+            <w:vAlign w:val="center"/>
+          </w:tcPr>
+          <w:p>
+            <w:pPr>
+              <w:spacing w:after="40" w:line="240" w:lineRule="auto"/>
+            </w:pPr>
+            <w:r>
+              <w:rPr>
+                <w:b/>
+                <w:sz w:val="20"/>
+              </w:rPr>
+              <w:t>Modele verilen kart bağlamı</w:t>
+            </w:r>
+          </w:p>
+        </w:tc>
+      </w:tr>
+      <w:tr>
+        <w:tblPrEx>
+          <w:tblCellMar>
+            <w:top w:w="0" w:type="dxa"/>
+            <w:left w:w="108" w:type="dxa"/>
+            <w:bottom w:w="0" w:type="dxa"/>
+            <w:right w:w="108" w:type="dxa"/>
+          </w:tblCellMar>
+        </w:tblPrEx>
+        <w:trPr>
+          <w:jc w:val="center"/>
+        </w:trPr>
+        <w:tc>
+          <w:tcPr>
+            <w:tcW w:w="1872" w:type="dxa"/>
+            <w:tcBorders>
+              <w:top w:val="single" w:color="D9D9D9" w:sz="4" w:space="0"/>
+              <w:left w:val="single" w:color="D9D9D9" w:sz="4" w:space="0"/>
+              <w:bottom w:val="single" w:color="D9D9D9" w:sz="4" w:space="0"/>
+              <w:right w:val="single" w:color="D9D9D9" w:sz="4" w:space="0"/>
+            </w:tcBorders>
+            <w:tcMar>
+              <w:top w:w="80" w:type="dxa"/>
+              <w:left w:w="80" w:type="dxa"/>
+              <w:bottom w:w="80" w:type="dxa"/>
+              <w:right w:w="80" w:type="dxa"/>
+            </w:tcMar>
+            <w:vAlign w:val="center"/>
+          </w:tcPr>
+          <w:p>
+            <w:pPr>
+              <w:spacing w:after="40" w:line="240" w:lineRule="auto"/>
+            </w:pPr>
+            <w:r>
+              <w:rPr>
+                <w:b w:val="0"/>
+                <w:sz w:val="20"/>
+              </w:rPr>
+              <w:t>Normal üretim</w:t>
+            </w:r>
+          </w:p>
+        </w:tc>
+        <w:tc>
+          <w:tcPr>
+            <w:tcW w:w="7704" w:type="dxa"/>
+            <w:tcBorders>
+              <w:top w:val="single" w:color="D9D9D9" w:sz="4" w:space="0"/>
+              <w:left w:val="single" w:color="D9D9D9" w:sz="4" w:space="0"/>
+              <w:bottom w:val="single" w:color="D9D9D9" w:sz="4" w:space="0"/>
+              <w:right w:val="single" w:color="D9D9D9" w:sz="4" w:space="0"/>
+            </w:tcBorders>
+            <w:tcMar>
+              <w:top w:w="80" w:type="dxa"/>
+              <w:left w:w="80" w:type="dxa"/>
+              <w:bottom w:w="80" w:type="dxa"/>
+              <w:right w:w="80" w:type="dxa"/>
+            </w:tcMar>
+            <w:vAlign w:val="center"/>
+          </w:tcPr>
+          <w:p>
+            <w:pPr>
+              <w:spacing w:after="40" w:line="240" w:lineRule="auto"/>
+            </w:pPr>
+            <w:r>
+              <w:rPr>
+                <w:b w:val="0"/>
+                <w:sz w:val="20"/>
+              </w:rPr>
+              <w:t>Ortak kurallar ve seçilen kartların tam metni.</w:t>
+            </w:r>
+          </w:p>
+        </w:tc>
+      </w:tr>
+      <w:tr>
+        <w:tblPrEx>
+          <w:tblCellMar>
+            <w:top w:w="0" w:type="dxa"/>
+            <w:left w:w="108" w:type="dxa"/>
+            <w:bottom w:w="0" w:type="dxa"/>
+            <w:right w:w="108" w:type="dxa"/>
+          </w:tblCellMar>
+        </w:tblPrEx>
+        <w:trPr>
+          <w:jc w:val="center"/>
+        </w:trPr>
+        <w:tc>
+          <w:tcPr>
+            <w:tcW w:w="1872" w:type="dxa"/>
+            <w:tcBorders>
+              <w:top w:val="single" w:color="D9D9D9" w:sz="4" w:space="0"/>
+              <w:left w:val="single" w:color="D9D9D9" w:sz="4" w:space="0"/>
+              <w:bottom w:val="single" w:color="D9D9D9" w:sz="4" w:space="0"/>
+              <w:right w:val="single" w:color="D9D9D9" w:sz="4" w:space="0"/>
+            </w:tcBorders>
+            <w:tcMar>
+              <w:top w:w="80" w:type="dxa"/>
+              <w:left w:w="80" w:type="dxa"/>
+              <w:bottom w:w="80" w:type="dxa"/>
+              <w:right w:w="80" w:type="dxa"/>
+            </w:tcMar>
+            <w:vAlign w:val="center"/>
+          </w:tcPr>
+          <w:p>
+            <w:pPr>
+              <w:spacing w:after="40" w:line="240" w:lineRule="auto"/>
+            </w:pPr>
+            <w:r>
+              <w:rPr>
+                <w:b w:val="0"/>
+                <w:sz w:val="20"/>
+              </w:rPr>
+              <w:t>A kolu</w:t>
+            </w:r>
+          </w:p>
+        </w:tc>
+        <w:tc>
+          <w:tcPr>
+            <w:tcW w:w="7704" w:type="dxa"/>
+            <w:tcBorders>
+              <w:top w:val="single" w:color="D9D9D9" w:sz="4" w:space="0"/>
+              <w:left w:val="single" w:color="D9D9D9" w:sz="4" w:space="0"/>
+              <w:bottom w:val="single" w:color="D9D9D9" w:sz="4" w:space="0"/>
+              <w:right w:val="single" w:color="D9D9D9" w:sz="4" w:space="0"/>
+            </w:tcBorders>
+            <w:tcMar>
+              <w:top w:w="80" w:type="dxa"/>
+              <w:left w:w="80" w:type="dxa"/>
+              <w:bottom w:w="80" w:type="dxa"/>
+              <w:right w:w="80" w:type="dxa"/>
+            </w:tcMar>
+            <w:vAlign w:val="center"/>
+          </w:tcPr>
+          <w:p>
+            <w:pPr>
+              <w:spacing w:after="40" w:line="240" w:lineRule="auto"/>
+            </w:pPr>
+            <w:r>
+              <w:rPr>
+                <w:b w:val="0"/>
+                <w:sz w:val="20"/>
+              </w:rPr>
+              <w:t>Seçilen kartların tam metni yok; ortak görev ve bazı özel yönergeler var.</w:t>
+            </w:r>
+          </w:p>
+        </w:tc>
+      </w:tr>
+      <w:tr>
+        <w:tblPrEx>
+          <w:tblCellMar>
+            <w:top w:w="0" w:type="dxa"/>
+            <w:left w:w="108" w:type="dxa"/>
+            <w:bottom w:w="0" w:type="dxa"/>
+            <w:right w:w="108" w:type="dxa"/>
+          </w:tblCellMar>
+        </w:tblPrEx>
+        <w:trPr>
+          <w:jc w:val="center"/>
+        </w:trPr>
+        <w:tc>
+          <w:tcPr>
+            <w:tcW w:w="1872" w:type="dxa"/>
+            <w:tcBorders>
+              <w:top w:val="single" w:color="D9D9D9" w:sz="4" w:space="0"/>
+              <w:left w:val="single" w:color="D9D9D9" w:sz="4" w:space="0"/>
+              <w:bottom w:val="single" w:color="D9D9D9" w:sz="4" w:space="0"/>
+              <w:right w:val="single" w:color="D9D9D9" w:sz="4" w:space="0"/>
+            </w:tcBorders>
+            <w:tcMar>
+              <w:top w:w="80" w:type="dxa"/>
+              <w:left w:w="80" w:type="dxa"/>
+              <w:bottom w:w="80" w:type="dxa"/>
+              <w:right w:w="80" w:type="dxa"/>
+            </w:tcMar>
+            <w:vAlign w:val="center"/>
+          </w:tcPr>
+          <w:p>
+            <w:pPr>
+              <w:spacing w:after="40" w:line="240" w:lineRule="auto"/>
+            </w:pPr>
+            <w:r>
+              <w:rPr>
+                <w:b w:val="0"/>
+                <w:sz w:val="20"/>
+              </w:rPr>
+              <w:t>B kolu</w:t>
+            </w:r>
+          </w:p>
+        </w:tc>
+        <w:tc>
+          <w:tcPr>
+            <w:tcW w:w="7704" w:type="dxa"/>
+            <w:tcBorders>
+              <w:top w:val="single" w:color="D9D9D9" w:sz="4" w:space="0"/>
+              <w:left w:val="single" w:color="D9D9D9" w:sz="4" w:space="0"/>
+              <w:bottom w:val="single" w:color="D9D9D9" w:sz="4" w:space="0"/>
+              <w:right w:val="single" w:color="D9D9D9" w:sz="4" w:space="0"/>
+            </w:tcBorders>
+            <w:tcMar>
+              <w:top w:w="80" w:type="dxa"/>
+              <w:left w:w="80" w:type="dxa"/>
+              <w:bottom w:w="80" w:type="dxa"/>
+              <w:right w:w="80" w:type="dxa"/>
+            </w:tcMar>
+            <w:vAlign w:val="center"/>
+          </w:tcPr>
+          <w:p>
+            <w:pPr>
+              <w:spacing w:after="40" w:line="240" w:lineRule="auto"/>
+            </w:pPr>
+            <w:r>
+              <w:rPr>
+                <w:b w:val="0"/>
+                <w:sz w:val="20"/>
+              </w:rPr>
+              <w:t>Seçilen kartların tam metni. Kaynakları normal üretime benzer; istem birebir aynı değil.</w:t>
+            </w:r>
+          </w:p>
+        </w:tc>
+      </w:tr>
+      <w:tr>
+        <w:tblPrEx>
+          <w:tblCellMar>
+            <w:top w:w="0" w:type="dxa"/>
+            <w:left w:w="108" w:type="dxa"/>
+            <w:bottom w:w="0" w:type="dxa"/>
+            <w:right w:w="108" w:type="dxa"/>
+          </w:tblCellMar>
+        </w:tblPrEx>
+        <w:trPr>
+          <w:jc w:val="center"/>
+        </w:trPr>
+        <w:tc>
+          <w:tcPr>
+            <w:tcW w:w="1872" w:type="dxa"/>
+            <w:tcBorders>
+              <w:top w:val="single" w:color="D9D9D9" w:sz="4" w:space="0"/>
+              <w:left w:val="single" w:color="D9D9D9" w:sz="4" w:space="0"/>
+              <w:bottom w:val="single" w:color="D9D9D9" w:sz="4" w:space="0"/>
+              <w:right w:val="single" w:color="D9D9D9" w:sz="4" w:space="0"/>
+            </w:tcBorders>
+            <w:tcMar>
+              <w:top w:w="80" w:type="dxa"/>
+              <w:left w:w="80" w:type="dxa"/>
+              <w:bottom w:w="80" w:type="dxa"/>
+              <w:right w:w="80" w:type="dxa"/>
+            </w:tcMar>
+            <w:vAlign w:val="center"/>
+          </w:tcPr>
+          <w:p>
+            <w:pPr>
+              <w:spacing w:after="40" w:line="240" w:lineRule="auto"/>
+            </w:pPr>
+            <w:r>
+              <w:rPr>
+                <w:b w:val="0"/>
+                <w:sz w:val="20"/>
+              </w:rPr>
+              <w:t>C kolu</w:t>
+            </w:r>
+          </w:p>
+        </w:tc>
+        <w:tc>
+          <w:tcPr>
+            <w:tcW w:w="7704" w:type="dxa"/>
+            <w:tcBorders>
+              <w:top w:val="single" w:color="D9D9D9" w:sz="4" w:space="0"/>
+              <w:left w:val="single" w:color="D9D9D9" w:sz="4" w:space="0"/>
+              <w:bottom w:val="single" w:color="D9D9D9" w:sz="4" w:space="0"/>
+              <w:right w:val="single" w:color="D9D9D9" w:sz="4" w:space="0"/>
+            </w:tcBorders>
+            <w:tcMar>
+              <w:top w:w="80" w:type="dxa"/>
+              <w:left w:w="80" w:type="dxa"/>
+              <w:bottom w:w="80" w:type="dxa"/>
+              <w:right w:w="80" w:type="dxa"/>
+            </w:tcMar>
+            <w:vAlign w:val="center"/>
+          </w:tcPr>
+          <w:p>
+            <w:pPr>
+              <w:spacing w:after="40" w:line="240" w:lineRule="auto"/>
+            </w:pPr>
+            <w:r>
+              <w:rPr>
+                <w:b w:val="0"/>
+                <w:sz w:val="20"/>
+              </w:rPr>
+              <w:t>Güncel davranış kartları belgesinin tamamı.</w:t>
+            </w:r>
+          </w:p>
+        </w:tc>
+      </w:tr>
+    </w:tbl>
+    <w:p>
+      <w:pPr>
+        <w:pStyle w:val="3"/>
+        <w:spacing w:before="140"/>
+      </w:pPr>
+      <w:r>
+        <w:t>23 Ekim tarihli eski prototipin ölçümleri</w:t>
+      </w:r>
+    </w:p>
+    <w:p>
+      <w:r>
+        <w:t>Yerel benchmark kaydında D01, 19 ay ve Gemini 3.5 Flash-Lite için kol başına bir ölçüm bulduk. Bu kayıtlar eski 26 sahneli, risk profilli bilgi tabanını kullanan prototipe aittir; güncel kart ve anlatı sözleşmesinin sonuçları değildir. Aşağıdaki toplam token değerlerini kayıtlı girdi ve çıktı sayaçlarını toplayarak hesapladık.</w:t>
+      </w:r>
+    </w:p>
+    <w:tbl>
+      <w:tblPr>
+        <w:tblStyle w:val="12"/>
+        <w:tblW w:w="0" w:type="auto"/>
+        <w:jc w:val="center"/>
+        <w:tblLayout w:type="autofit"/>
+        <w:tblCellMar>
+          <w:top w:w="0" w:type="dxa"/>
+          <w:left w:w="108" w:type="dxa"/>
+          <w:bottom w:w="0" w:type="dxa"/>
+          <w:right w:w="108" w:type="dxa"/>
+        </w:tblCellMar>
+      </w:tblPr>
+      <w:tblGrid>
+        <w:gridCol w:w="1586"/>
+        <w:gridCol w:w="1585"/>
+        <w:gridCol w:w="1585"/>
+        <w:gridCol w:w="1641"/>
+        <w:gridCol w:w="1782"/>
+        <w:gridCol w:w="1586"/>
+      </w:tblGrid>
+      <w:tr>
+        <w:tblPrEx>
+          <w:tblCellMar>
+            <w:top w:w="0" w:type="dxa"/>
+            <w:left w:w="108" w:type="dxa"/>
+            <w:bottom w:w="0" w:type="dxa"/>
+            <w:right w:w="108" w:type="dxa"/>
+          </w:tblCellMar>
+        </w:tblPrEx>
+        <w:trPr>
+          <w:tblHeader/>
+          <w:jc w:val="center"/>
+        </w:trPr>
+        <w:tc>
+          <w:tcPr>
+            <w:tcW w:w="1601" w:type="dxa"/>
+            <w:tcBorders>
+              <w:top w:val="single" w:color="D9D9D9" w:sz="4" w:space="0"/>
+              <w:left w:val="single" w:color="D9D9D9" w:sz="4" w:space="0"/>
+              <w:bottom w:val="single" w:color="D9D9D9" w:sz="4" w:space="0"/>
+              <w:right w:val="single" w:color="D9D9D9" w:sz="4" w:space="0"/>
+            </w:tcBorders>
+            <w:shd w:val="clear" w:color="auto" w:fill="E8EDF2"/>
+            <w:tcMar>
+              <w:top w:w="80" w:type="dxa"/>
+              <w:left w:w="80" w:type="dxa"/>
+              <w:bottom w:w="80" w:type="dxa"/>
+              <w:right w:w="80" w:type="dxa"/>
+            </w:tcMar>
+            <w:vAlign w:val="center"/>
+          </w:tcPr>
+          <w:p>
+            <w:pPr>
+              <w:spacing w:after="40" w:line="240" w:lineRule="auto"/>
+            </w:pPr>
+            <w:r>
+              <w:rPr>
+                <w:b/>
+                <w:sz w:val="20"/>
+              </w:rPr>
+              <w:t>Kol</w:t>
+            </w:r>
+          </w:p>
+        </w:tc>
+        <w:tc>
+          <w:tcPr>
+            <w:tcW w:w="1601" w:type="dxa"/>
+            <w:tcBorders>
+              <w:top w:val="single" w:color="D9D9D9" w:sz="4" w:space="0"/>
+              <w:left w:val="single" w:color="D9D9D9" w:sz="4" w:space="0"/>
+              <w:bottom w:val="single" w:color="D9D9D9" w:sz="4" w:space="0"/>
+              <w:right w:val="single" w:color="D9D9D9" w:sz="4" w:space="0"/>
+            </w:tcBorders>
+            <w:shd w:val="clear" w:color="auto" w:fill="E8EDF2"/>
+            <w:tcMar>
+              <w:top w:w="80" w:type="dxa"/>
+              <w:left w:w="80" w:type="dxa"/>
+              <w:bottom w:w="80" w:type="dxa"/>
+              <w:right w:w="80" w:type="dxa"/>
+            </w:tcMar>
+            <w:vAlign w:val="center"/>
+          </w:tcPr>
+          <w:p>
+            <w:pPr>
+              <w:spacing w:after="40" w:line="240" w:lineRule="auto"/>
+            </w:pPr>
+            <w:r>
+              <w:rPr>
+                <w:b/>
+                <w:sz w:val="20"/>
+              </w:rPr>
+              <w:t>Girdi tokenı</w:t>
+            </w:r>
+          </w:p>
+        </w:tc>
+        <w:tc>
+          <w:tcPr>
+            <w:tcW w:w="1601" w:type="dxa"/>
+            <w:tcBorders>
+              <w:top w:val="single" w:color="D9D9D9" w:sz="4" w:space="0"/>
+              <w:left w:val="single" w:color="D9D9D9" w:sz="4" w:space="0"/>
+              <w:bottom w:val="single" w:color="D9D9D9" w:sz="4" w:space="0"/>
+              <w:right w:val="single" w:color="D9D9D9" w:sz="4" w:space="0"/>
+            </w:tcBorders>
+            <w:shd w:val="clear" w:color="auto" w:fill="E8EDF2"/>
+            <w:tcMar>
+              <w:top w:w="80" w:type="dxa"/>
+              <w:left w:w="80" w:type="dxa"/>
+              <w:bottom w:w="80" w:type="dxa"/>
+              <w:right w:w="80" w:type="dxa"/>
+            </w:tcMar>
+            <w:vAlign w:val="center"/>
+          </w:tcPr>
+          <w:p>
+            <w:pPr>
+              <w:spacing w:after="40" w:line="240" w:lineRule="auto"/>
+            </w:pPr>
+            <w:r>
+              <w:rPr>
+                <w:b/>
+                <w:sz w:val="20"/>
+              </w:rPr>
+              <w:t>Çıktı tokenı</w:t>
+            </w:r>
+          </w:p>
+        </w:tc>
+        <w:tc>
+          <w:tcPr>
+            <w:tcW w:w="1601" w:type="dxa"/>
+            <w:tcBorders>
+              <w:top w:val="single" w:color="D9D9D9" w:sz="4" w:space="0"/>
+              <w:left w:val="single" w:color="D9D9D9" w:sz="4" w:space="0"/>
+              <w:bottom w:val="single" w:color="D9D9D9" w:sz="4" w:space="0"/>
+              <w:right w:val="single" w:color="D9D9D9" w:sz="4" w:space="0"/>
+            </w:tcBorders>
+            <w:shd w:val="clear" w:color="auto" w:fill="E8EDF2"/>
+            <w:tcMar>
+              <w:top w:w="80" w:type="dxa"/>
+              <w:left w:w="80" w:type="dxa"/>
+              <w:bottom w:w="80" w:type="dxa"/>
+              <w:right w:w="80" w:type="dxa"/>
+            </w:tcMar>
+            <w:vAlign w:val="center"/>
+          </w:tcPr>
+          <w:p>
+            <w:pPr>
+              <w:spacing w:after="40" w:line="240" w:lineRule="auto"/>
+            </w:pPr>
+            <w:r>
+              <w:rPr>
+                <w:b/>
+                <w:sz w:val="20"/>
+              </w:rPr>
+              <w:t>Toplam token</w:t>
+            </w:r>
+          </w:p>
+        </w:tc>
+        <w:tc>
+          <w:tcPr>
+            <w:tcW w:w="1601" w:type="dxa"/>
+            <w:tcBorders>
+              <w:top w:val="single" w:color="D9D9D9" w:sz="4" w:space="0"/>
+              <w:left w:val="single" w:color="D9D9D9" w:sz="4" w:space="0"/>
+              <w:bottom w:val="single" w:color="D9D9D9" w:sz="4" w:space="0"/>
+              <w:right w:val="single" w:color="D9D9D9" w:sz="4" w:space="0"/>
+            </w:tcBorders>
+            <w:shd w:val="clear" w:color="auto" w:fill="E8EDF2"/>
+            <w:tcMar>
+              <w:top w:w="80" w:type="dxa"/>
+              <w:left w:w="80" w:type="dxa"/>
+              <w:bottom w:w="80" w:type="dxa"/>
+              <w:right w:w="80" w:type="dxa"/>
+            </w:tcMar>
+            <w:vAlign w:val="center"/>
+          </w:tcPr>
+          <w:p>
+            <w:pPr>
+              <w:spacing w:after="40" w:line="240" w:lineRule="auto"/>
+            </w:pPr>
+            <w:r>
+              <w:rPr>
+                <w:b/>
+                <w:sz w:val="20"/>
+              </w:rPr>
+              <w:t>API süresi</w:t>
+            </w:r>
+          </w:p>
+        </w:tc>
+        <w:tc>
+          <w:tcPr>
+            <w:tcW w:w="1601" w:type="dxa"/>
+            <w:tcBorders>
+              <w:top w:val="single" w:color="D9D9D9" w:sz="4" w:space="0"/>
+              <w:left w:val="single" w:color="D9D9D9" w:sz="4" w:space="0"/>
+              <w:bottom w:val="single" w:color="D9D9D9" w:sz="4" w:space="0"/>
+              <w:right w:val="single" w:color="D9D9D9" w:sz="4" w:space="0"/>
+            </w:tcBorders>
+            <w:shd w:val="clear" w:color="auto" w:fill="E8EDF2"/>
+            <w:tcMar>
+              <w:top w:w="80" w:type="dxa"/>
+              <w:left w:w="80" w:type="dxa"/>
+              <w:bottom w:w="80" w:type="dxa"/>
+              <w:right w:w="80" w:type="dxa"/>
+            </w:tcMar>
+            <w:vAlign w:val="center"/>
+          </w:tcPr>
+          <w:p>
+            <w:pPr>
+              <w:spacing w:after="40" w:line="240" w:lineRule="auto"/>
+            </w:pPr>
+            <w:r>
+              <w:rPr>
+                <w:b/>
+                <w:sz w:val="20"/>
+              </w:rPr>
+              <w:t>Tekrar</w:t>
+            </w:r>
+          </w:p>
+        </w:tc>
+      </w:tr>
+      <w:tr>
+        <w:tblPrEx>
+          <w:tblCellMar>
+            <w:top w:w="0" w:type="dxa"/>
+            <w:left w:w="108" w:type="dxa"/>
+            <w:bottom w:w="0" w:type="dxa"/>
+            <w:right w:w="108" w:type="dxa"/>
+          </w:tblCellMar>
+        </w:tblPrEx>
+        <w:trPr>
+          <w:jc w:val="center"/>
+        </w:trPr>
+        <w:tc>
+          <w:tcPr>
+            <w:tcW w:w="1584" w:type="dxa"/>
+            <w:tcBorders>
+              <w:top w:val="single" w:color="D9D9D9" w:sz="4" w:space="0"/>
+              <w:left w:val="single" w:color="D9D9D9" w:sz="4" w:space="0"/>
+              <w:bottom w:val="single" w:color="D9D9D9" w:sz="4" w:space="0"/>
+              <w:right w:val="single" w:color="D9D9D9" w:sz="4" w:space="0"/>
+            </w:tcBorders>
+            <w:tcMar>
+              <w:top w:w="80" w:type="dxa"/>
+              <w:left w:w="80" w:type="dxa"/>
+              <w:bottom w:w="80" w:type="dxa"/>
+              <w:right w:w="80" w:type="dxa"/>
+            </w:tcMar>
+            <w:vAlign w:val="center"/>
+          </w:tcPr>
+          <w:p>
+            <w:pPr>
+              <w:spacing w:after="40" w:line="240" w:lineRule="auto"/>
+            </w:pPr>
+            <w:r>
+              <w:rPr>
+                <w:b w:val="0"/>
+                <w:sz w:val="20"/>
+              </w:rPr>
+              <w:t>A temel</w:t>
+            </w:r>
+          </w:p>
+        </w:tc>
+        <w:tc>
+          <w:tcPr>
+            <w:tcW w:w="1512" w:type="dxa"/>
+            <w:tcBorders>
+              <w:top w:val="single" w:color="D9D9D9" w:sz="4" w:space="0"/>
+              <w:left w:val="single" w:color="D9D9D9" w:sz="4" w:space="0"/>
+              <w:bottom w:val="single" w:color="D9D9D9" w:sz="4" w:space="0"/>
+              <w:right w:val="single" w:color="D9D9D9" w:sz="4" w:space="0"/>
+            </w:tcBorders>
+            <w:tcMar>
+              <w:top w:w="80" w:type="dxa"/>
+              <w:left w:w="80" w:type="dxa"/>
+              <w:bottom w:w="80" w:type="dxa"/>
+              <w:right w:w="80" w:type="dxa"/>
+            </w:tcMar>
+            <w:vAlign w:val="center"/>
+          </w:tcPr>
+          <w:p>
+            <w:pPr>
+              <w:spacing w:after="40" w:line="240" w:lineRule="auto"/>
+            </w:pPr>
+            <w:r>
+              <w:rPr>
+                <w:b w:val="0"/>
+                <w:sz w:val="20"/>
+              </w:rPr>
+              <w:t>975</w:t>
+            </w:r>
+          </w:p>
+        </w:tc>
+        <w:tc>
+          <w:tcPr>
+            <w:tcW w:w="1512" w:type="dxa"/>
+            <w:tcBorders>
+              <w:top w:val="single" w:color="D9D9D9" w:sz="4" w:space="0"/>
+              <w:left w:val="single" w:color="D9D9D9" w:sz="4" w:space="0"/>
+              <w:bottom w:val="single" w:color="D9D9D9" w:sz="4" w:space="0"/>
+              <w:right w:val="single" w:color="D9D9D9" w:sz="4" w:space="0"/>
+            </w:tcBorders>
+            <w:tcMar>
+              <w:top w:w="80" w:type="dxa"/>
+              <w:left w:w="80" w:type="dxa"/>
+              <w:bottom w:w="80" w:type="dxa"/>
+              <w:right w:w="80" w:type="dxa"/>
+            </w:tcMar>
+            <w:vAlign w:val="center"/>
+          </w:tcPr>
+          <w:p>
+            <w:pPr>
+              <w:spacing w:after="40" w:line="240" w:lineRule="auto"/>
+            </w:pPr>
+            <w:r>
+              <w:rPr>
+                <w:b w:val="0"/>
+                <w:sz w:val="20"/>
+              </w:rPr>
+              <w:t>8.056</w:t>
+            </w:r>
+          </w:p>
+        </w:tc>
+        <w:tc>
+          <w:tcPr>
+            <w:tcW w:w="1656" w:type="dxa"/>
+            <w:tcBorders>
+              <w:top w:val="single" w:color="D9D9D9" w:sz="4" w:space="0"/>
+              <w:left w:val="single" w:color="D9D9D9" w:sz="4" w:space="0"/>
+              <w:bottom w:val="single" w:color="D9D9D9" w:sz="4" w:space="0"/>
+              <w:right w:val="single" w:color="D9D9D9" w:sz="4" w:space="0"/>
+            </w:tcBorders>
+            <w:tcMar>
+              <w:top w:w="80" w:type="dxa"/>
+              <w:left w:w="80" w:type="dxa"/>
+              <w:bottom w:w="80" w:type="dxa"/>
+              <w:right w:w="80" w:type="dxa"/>
+            </w:tcMar>
+            <w:vAlign w:val="center"/>
+          </w:tcPr>
+          <w:p>
+            <w:pPr>
+              <w:spacing w:after="40" w:line="240" w:lineRule="auto"/>
+            </w:pPr>
+            <w:r>
+              <w:rPr>
+                <w:b w:val="0"/>
+                <w:sz w:val="20"/>
+              </w:rPr>
+              <w:t>9.031</w:t>
+            </w:r>
+          </w:p>
+        </w:tc>
+        <w:tc>
+          <w:tcPr>
+            <w:tcW w:w="1800" w:type="dxa"/>
+            <w:tcBorders>
+              <w:top w:val="single" w:color="D9D9D9" w:sz="4" w:space="0"/>
+              <w:left w:val="single" w:color="D9D9D9" w:sz="4" w:space="0"/>
+              <w:bottom w:val="single" w:color="D9D9D9" w:sz="4" w:space="0"/>
+              <w:right w:val="single" w:color="D9D9D9" w:sz="4" w:space="0"/>
+            </w:tcBorders>
+            <w:tcMar>
+              <w:top w:w="80" w:type="dxa"/>
+              <w:left w:w="80" w:type="dxa"/>
+              <w:bottom w:w="80" w:type="dxa"/>
+              <w:right w:w="80" w:type="dxa"/>
+            </w:tcMar>
+            <w:vAlign w:val="center"/>
+          </w:tcPr>
+          <w:p>
+            <w:pPr>
+              <w:spacing w:after="40" w:line="240" w:lineRule="auto"/>
+            </w:pPr>
+            <w:r>
+              <w:rPr>
+                <w:b w:val="0"/>
+                <w:sz w:val="20"/>
+              </w:rPr>
+              <w:t>29,153 sn</w:t>
+            </w:r>
+          </w:p>
+        </w:tc>
+        <w:tc>
+          <w:tcPr>
+            <w:tcW w:w="1512" w:type="dxa"/>
+            <w:tcBorders>
+              <w:top w:val="single" w:color="D9D9D9" w:sz="4" w:space="0"/>
+              <w:left w:val="single" w:color="D9D9D9" w:sz="4" w:space="0"/>
+              <w:bottom w:val="single" w:color="D9D9D9" w:sz="4" w:space="0"/>
+              <w:right w:val="single" w:color="D9D9D9" w:sz="4" w:space="0"/>
+            </w:tcBorders>
+            <w:tcMar>
+              <w:top w:w="80" w:type="dxa"/>
+              <w:left w:w="80" w:type="dxa"/>
+              <w:bottom w:w="80" w:type="dxa"/>
+              <w:right w:w="80" w:type="dxa"/>
+            </w:tcMar>
+            <w:vAlign w:val="center"/>
+          </w:tcPr>
+          <w:p>
+            <w:pPr>
+              <w:spacing w:after="40" w:line="240" w:lineRule="auto"/>
+            </w:pPr>
+            <w:r>
+              <w:rPr>
+                <w:b w:val="0"/>
+                <w:sz w:val="20"/>
+              </w:rPr>
+              <w:t>0</w:t>
+            </w:r>
+          </w:p>
+        </w:tc>
+      </w:tr>
+      <w:tr>
+        <w:tblPrEx>
+          <w:tblCellMar>
+            <w:top w:w="0" w:type="dxa"/>
+            <w:left w:w="108" w:type="dxa"/>
+            <w:bottom w:w="0" w:type="dxa"/>
+            <w:right w:w="108" w:type="dxa"/>
+          </w:tblCellMar>
+        </w:tblPrEx>
+        <w:trPr>
+          <w:jc w:val="center"/>
+        </w:trPr>
+        <w:tc>
+          <w:tcPr>
+            <w:tcW w:w="1584" w:type="dxa"/>
+            <w:tcBorders>
+              <w:top w:val="single" w:color="D9D9D9" w:sz="4" w:space="0"/>
+              <w:left w:val="single" w:color="D9D9D9" w:sz="4" w:space="0"/>
+              <w:bottom w:val="single" w:color="D9D9D9" w:sz="4" w:space="0"/>
+              <w:right w:val="single" w:color="D9D9D9" w:sz="4" w:space="0"/>
+            </w:tcBorders>
+            <w:tcMar>
+              <w:top w:w="80" w:type="dxa"/>
+              <w:left w:w="80" w:type="dxa"/>
+              <w:bottom w:w="80" w:type="dxa"/>
+              <w:right w:w="80" w:type="dxa"/>
+            </w:tcMar>
+            <w:vAlign w:val="center"/>
+          </w:tcPr>
+          <w:p>
+            <w:pPr>
+              <w:spacing w:after="40" w:line="240" w:lineRule="auto"/>
+            </w:pPr>
+            <w:r>
+              <w:rPr>
+                <w:b w:val="0"/>
+                <w:sz w:val="20"/>
+              </w:rPr>
+              <w:t>B seçici</w:t>
+            </w:r>
+          </w:p>
+        </w:tc>
+        <w:tc>
+          <w:tcPr>
+            <w:tcW w:w="1512" w:type="dxa"/>
+            <w:tcBorders>
+              <w:top w:val="single" w:color="D9D9D9" w:sz="4" w:space="0"/>
+              <w:left w:val="single" w:color="D9D9D9" w:sz="4" w:space="0"/>
+              <w:bottom w:val="single" w:color="D9D9D9" w:sz="4" w:space="0"/>
+              <w:right w:val="single" w:color="D9D9D9" w:sz="4" w:space="0"/>
+            </w:tcBorders>
+            <w:tcMar>
+              <w:top w:w="80" w:type="dxa"/>
+              <w:left w:w="80" w:type="dxa"/>
+              <w:bottom w:w="80" w:type="dxa"/>
+              <w:right w:w="80" w:type="dxa"/>
+            </w:tcMar>
+            <w:vAlign w:val="center"/>
+          </w:tcPr>
+          <w:p>
+            <w:pPr>
+              <w:spacing w:after="40" w:line="240" w:lineRule="auto"/>
+            </w:pPr>
+            <w:r>
+              <w:rPr>
+                <w:b w:val="0"/>
+                <w:sz w:val="20"/>
+              </w:rPr>
+              <w:t>1.440</w:t>
+            </w:r>
+          </w:p>
+        </w:tc>
+        <w:tc>
+          <w:tcPr>
+            <w:tcW w:w="1512" w:type="dxa"/>
+            <w:tcBorders>
+              <w:top w:val="single" w:color="D9D9D9" w:sz="4" w:space="0"/>
+              <w:left w:val="single" w:color="D9D9D9" w:sz="4" w:space="0"/>
+              <w:bottom w:val="single" w:color="D9D9D9" w:sz="4" w:space="0"/>
+              <w:right w:val="single" w:color="D9D9D9" w:sz="4" w:space="0"/>
+            </w:tcBorders>
+            <w:tcMar>
+              <w:top w:w="80" w:type="dxa"/>
+              <w:left w:w="80" w:type="dxa"/>
+              <w:bottom w:w="80" w:type="dxa"/>
+              <w:right w:w="80" w:type="dxa"/>
+            </w:tcMar>
+            <w:vAlign w:val="center"/>
+          </w:tcPr>
+          <w:p>
+            <w:pPr>
+              <w:spacing w:after="40" w:line="240" w:lineRule="auto"/>
+            </w:pPr>
+            <w:r>
+              <w:rPr>
+                <w:b w:val="0"/>
+                <w:sz w:val="20"/>
+              </w:rPr>
+              <w:t>6.062</w:t>
+            </w:r>
+          </w:p>
+        </w:tc>
+        <w:tc>
+          <w:tcPr>
+            <w:tcW w:w="1656" w:type="dxa"/>
+            <w:tcBorders>
+              <w:top w:val="single" w:color="D9D9D9" w:sz="4" w:space="0"/>
+              <w:left w:val="single" w:color="D9D9D9" w:sz="4" w:space="0"/>
+              <w:bottom w:val="single" w:color="D9D9D9" w:sz="4" w:space="0"/>
+              <w:right w:val="single" w:color="D9D9D9" w:sz="4" w:space="0"/>
+            </w:tcBorders>
+            <w:tcMar>
+              <w:top w:w="80" w:type="dxa"/>
+              <w:left w:w="80" w:type="dxa"/>
+              <w:bottom w:w="80" w:type="dxa"/>
+              <w:right w:w="80" w:type="dxa"/>
+            </w:tcMar>
+            <w:vAlign w:val="center"/>
+          </w:tcPr>
+          <w:p>
+            <w:pPr>
+              <w:spacing w:after="40" w:line="240" w:lineRule="auto"/>
+            </w:pPr>
+            <w:r>
+              <w:rPr>
+                <w:b w:val="0"/>
+                <w:sz w:val="20"/>
+              </w:rPr>
+              <w:t>7.502</w:t>
+            </w:r>
+          </w:p>
+        </w:tc>
+        <w:tc>
+          <w:tcPr>
+            <w:tcW w:w="1800" w:type="dxa"/>
+            <w:tcBorders>
+              <w:top w:val="single" w:color="D9D9D9" w:sz="4" w:space="0"/>
+              <w:left w:val="single" w:color="D9D9D9" w:sz="4" w:space="0"/>
+              <w:bottom w:val="single" w:color="D9D9D9" w:sz="4" w:space="0"/>
+              <w:right w:val="single" w:color="D9D9D9" w:sz="4" w:space="0"/>
+            </w:tcBorders>
+            <w:tcMar>
+              <w:top w:w="80" w:type="dxa"/>
+              <w:left w:w="80" w:type="dxa"/>
+              <w:bottom w:w="80" w:type="dxa"/>
+              <w:right w:w="80" w:type="dxa"/>
+            </w:tcMar>
+            <w:vAlign w:val="center"/>
+          </w:tcPr>
+          <w:p>
+            <w:pPr>
+              <w:spacing w:after="40" w:line="240" w:lineRule="auto"/>
+            </w:pPr>
+            <w:r>
+              <w:rPr>
+                <w:b w:val="0"/>
+                <w:sz w:val="20"/>
+              </w:rPr>
+              <w:t>30,159 sn</w:t>
+            </w:r>
+          </w:p>
+        </w:tc>
+        <w:tc>
+          <w:tcPr>
+            <w:tcW w:w="1512" w:type="dxa"/>
+            <w:tcBorders>
+              <w:top w:val="single" w:color="D9D9D9" w:sz="4" w:space="0"/>
+              <w:left w:val="single" w:color="D9D9D9" w:sz="4" w:space="0"/>
+              <w:bottom w:val="single" w:color="D9D9D9" w:sz="4" w:space="0"/>
+              <w:right w:val="single" w:color="D9D9D9" w:sz="4" w:space="0"/>
+            </w:tcBorders>
+            <w:tcMar>
+              <w:top w:w="80" w:type="dxa"/>
+              <w:left w:w="80" w:type="dxa"/>
+              <w:bottom w:w="80" w:type="dxa"/>
+              <w:right w:w="80" w:type="dxa"/>
+            </w:tcMar>
+            <w:vAlign w:val="center"/>
+          </w:tcPr>
+          <w:p>
+            <w:pPr>
+              <w:spacing w:after="40" w:line="240" w:lineRule="auto"/>
+            </w:pPr>
+            <w:r>
+              <w:rPr>
+                <w:b w:val="0"/>
+                <w:sz w:val="20"/>
+              </w:rPr>
+              <w:t>0</w:t>
+            </w:r>
+          </w:p>
+        </w:tc>
+      </w:tr>
+      <w:tr>
+        <w:tblPrEx>
+          <w:tblCellMar>
+            <w:top w:w="0" w:type="dxa"/>
+            <w:left w:w="108" w:type="dxa"/>
+            <w:bottom w:w="0" w:type="dxa"/>
+            <w:right w:w="108" w:type="dxa"/>
+          </w:tblCellMar>
+        </w:tblPrEx>
+        <w:trPr>
+          <w:jc w:val="center"/>
+        </w:trPr>
+        <w:tc>
+          <w:tcPr>
+            <w:tcW w:w="1584" w:type="dxa"/>
+            <w:tcBorders>
+              <w:top w:val="single" w:color="D9D9D9" w:sz="4" w:space="0"/>
+              <w:left w:val="single" w:color="D9D9D9" w:sz="4" w:space="0"/>
+              <w:bottom w:val="single" w:color="D9D9D9" w:sz="4" w:space="0"/>
+              <w:right w:val="single" w:color="D9D9D9" w:sz="4" w:space="0"/>
+            </w:tcBorders>
+            <w:tcMar>
+              <w:top w:w="80" w:type="dxa"/>
+              <w:left w:w="80" w:type="dxa"/>
+              <w:bottom w:w="80" w:type="dxa"/>
+              <w:right w:w="80" w:type="dxa"/>
+            </w:tcMar>
+            <w:vAlign w:val="center"/>
+          </w:tcPr>
+          <w:p>
+            <w:pPr>
+              <w:spacing w:after="40" w:line="240" w:lineRule="auto"/>
+            </w:pPr>
+            <w:r>
+              <w:rPr>
+                <w:b w:val="0"/>
+                <w:sz w:val="20"/>
+              </w:rPr>
+              <w:t>C tam bağlam</w:t>
+            </w:r>
+          </w:p>
+        </w:tc>
+        <w:tc>
+          <w:tcPr>
+            <w:tcW w:w="1512" w:type="dxa"/>
+            <w:tcBorders>
+              <w:top w:val="single" w:color="D9D9D9" w:sz="4" w:space="0"/>
+              <w:left w:val="single" w:color="D9D9D9" w:sz="4" w:space="0"/>
+              <w:bottom w:val="single" w:color="D9D9D9" w:sz="4" w:space="0"/>
+              <w:right w:val="single" w:color="D9D9D9" w:sz="4" w:space="0"/>
+            </w:tcBorders>
+            <w:tcMar>
+              <w:top w:w="80" w:type="dxa"/>
+              <w:left w:w="80" w:type="dxa"/>
+              <w:bottom w:w="80" w:type="dxa"/>
+              <w:right w:w="80" w:type="dxa"/>
+            </w:tcMar>
+            <w:vAlign w:val="center"/>
+          </w:tcPr>
+          <w:p>
+            <w:pPr>
+              <w:spacing w:after="40" w:line="240" w:lineRule="auto"/>
+            </w:pPr>
+            <w:r>
+              <w:rPr>
+                <w:b w:val="0"/>
+                <w:sz w:val="20"/>
+              </w:rPr>
+              <w:t>3.535</w:t>
+            </w:r>
+          </w:p>
+        </w:tc>
+        <w:tc>
+          <w:tcPr>
+            <w:tcW w:w="1512" w:type="dxa"/>
+            <w:tcBorders>
+              <w:top w:val="single" w:color="D9D9D9" w:sz="4" w:space="0"/>
+              <w:left w:val="single" w:color="D9D9D9" w:sz="4" w:space="0"/>
+              <w:bottom w:val="single" w:color="D9D9D9" w:sz="4" w:space="0"/>
+              <w:right w:val="single" w:color="D9D9D9" w:sz="4" w:space="0"/>
+            </w:tcBorders>
+            <w:tcMar>
+              <w:top w:w="80" w:type="dxa"/>
+              <w:left w:w="80" w:type="dxa"/>
+              <w:bottom w:w="80" w:type="dxa"/>
+              <w:right w:w="80" w:type="dxa"/>
+            </w:tcMar>
+            <w:vAlign w:val="center"/>
+          </w:tcPr>
+          <w:p>
+            <w:pPr>
+              <w:spacing w:after="40" w:line="240" w:lineRule="auto"/>
+            </w:pPr>
+            <w:r>
+              <w:rPr>
+                <w:b w:val="0"/>
+                <w:sz w:val="20"/>
+              </w:rPr>
+              <w:t>8.671</w:t>
+            </w:r>
+          </w:p>
+        </w:tc>
+        <w:tc>
+          <w:tcPr>
+            <w:tcW w:w="1656" w:type="dxa"/>
+            <w:tcBorders>
+              <w:top w:val="single" w:color="D9D9D9" w:sz="4" w:space="0"/>
+              <w:left w:val="single" w:color="D9D9D9" w:sz="4" w:space="0"/>
+              <w:bottom w:val="single" w:color="D9D9D9" w:sz="4" w:space="0"/>
+              <w:right w:val="single" w:color="D9D9D9" w:sz="4" w:space="0"/>
+            </w:tcBorders>
+            <w:tcMar>
+              <w:top w:w="80" w:type="dxa"/>
+              <w:left w:w="80" w:type="dxa"/>
+              <w:bottom w:w="80" w:type="dxa"/>
+              <w:right w:w="80" w:type="dxa"/>
+            </w:tcMar>
+            <w:vAlign w:val="center"/>
+          </w:tcPr>
+          <w:p>
+            <w:pPr>
+              <w:spacing w:after="40" w:line="240" w:lineRule="auto"/>
+            </w:pPr>
+            <w:r>
+              <w:rPr>
+                <w:b w:val="0"/>
+                <w:sz w:val="20"/>
+              </w:rPr>
+              <w:t>12.206</w:t>
+            </w:r>
+          </w:p>
+        </w:tc>
+        <w:tc>
+          <w:tcPr>
+            <w:tcW w:w="1800" w:type="dxa"/>
+            <w:tcBorders>
+              <w:top w:val="single" w:color="D9D9D9" w:sz="4" w:space="0"/>
+              <w:left w:val="single" w:color="D9D9D9" w:sz="4" w:space="0"/>
+              <w:bottom w:val="single" w:color="D9D9D9" w:sz="4" w:space="0"/>
+              <w:right w:val="single" w:color="D9D9D9" w:sz="4" w:space="0"/>
+            </w:tcBorders>
+            <w:tcMar>
+              <w:top w:w="80" w:type="dxa"/>
+              <w:left w:w="80" w:type="dxa"/>
+              <w:bottom w:w="80" w:type="dxa"/>
+              <w:right w:w="80" w:type="dxa"/>
+            </w:tcMar>
+            <w:vAlign w:val="center"/>
+          </w:tcPr>
+          <w:p>
+            <w:pPr>
+              <w:spacing w:after="40" w:line="240" w:lineRule="auto"/>
+            </w:pPr>
+            <w:r>
+              <w:rPr>
+                <w:b w:val="0"/>
+                <w:sz w:val="20"/>
+              </w:rPr>
+              <w:t>19,455 sn</w:t>
+            </w:r>
+          </w:p>
+        </w:tc>
+        <w:tc>
+          <w:tcPr>
+            <w:tcW w:w="1512" w:type="dxa"/>
+            <w:tcBorders>
+              <w:top w:val="single" w:color="D9D9D9" w:sz="4" w:space="0"/>
+              <w:left w:val="single" w:color="D9D9D9" w:sz="4" w:space="0"/>
+              <w:bottom w:val="single" w:color="D9D9D9" w:sz="4" w:space="0"/>
+              <w:right w:val="single" w:color="D9D9D9" w:sz="4" w:space="0"/>
+            </w:tcBorders>
+            <w:tcMar>
+              <w:top w:w="80" w:type="dxa"/>
+              <w:left w:w="80" w:type="dxa"/>
+              <w:bottom w:w="80" w:type="dxa"/>
+              <w:right w:w="80" w:type="dxa"/>
+            </w:tcMar>
+            <w:vAlign w:val="center"/>
+          </w:tcPr>
+          <w:p>
+            <w:pPr>
+              <w:spacing w:after="40" w:line="240" w:lineRule="auto"/>
+            </w:pPr>
+            <w:r>
+              <w:rPr>
+                <w:b w:val="0"/>
+                <w:sz w:val="20"/>
+              </w:rPr>
+              <w:t>1</w:t>
+            </w:r>
+          </w:p>
+        </w:tc>
+      </w:tr>
+    </w:tbl>
+    <w:p>
+      <w:pPr>
+        <w:spacing w:before="140"/>
+      </w:pPr>
+      <w:r>
+        <w:t>Bu tek üçlüde B, A’ya göre 465 fazla girdi tokenı kullandı (%47,7 artış); çıktı 1.994 token, toplam kullanım 1.529 token azaldı (%16,9 toplam azalma). Kayıtlı API süresi 1,006 saniye arttı (%3,5). C’de toplam token A’ya göre %35,2 arttı. C’nin görünen süresi yalnızca başarılı çağrıya ait; bir tekrarın başarısız çağrı süresini ve maliyetini kapsamıyor. Bu yüzden C’nin daha hızlı olduğu sonucunu çıkarmıyoruz.</w:t>
+      </w:r>
+    </w:p>
+    <w:p>
+      <w:r>
+        <w:t>B için seçici kaynak getirme alanı 2,2804 ms kaydedilmiş. C’de bütün bağlam eklenmesine rağmen bu işlem aynı zamanlayıcıyla ölçülmediğinden 0 ms değeri işlemin süresiz olduğu anlamına gelmiyor. Üç çıktı da eski şema ve zamanlama kontrollerini geçti; ortam anahtar sözcüğü kontrolünü yalnız C geçti. Bu kontroller içerik doğruluğunun kanıtı değil. Ham cevaplar ve tam istemler saklanmadığı için ayrıntılı içerik karşılaştırması yapamıyoruz.</w:t>
+      </w:r>
+    </w:p>
+    <w:p>
+      <w:pPr>
+        <w:pStyle w:val="3"/>
+      </w:pPr>
+      <w:r>
+        <w:t>Ölçüm sınırları ve</w:t>
+      </w:r>
+      <w:bookmarkStart w:id="0" w:name="_GoBack"/>
+      <w:bookmarkEnd w:id="0"/>
+      <w:r>
+        <w:t xml:space="preserve"> tamamlanacak karşılaştırma</w:t>
+      </w:r>
+    </w:p>
+    <w:p>
+      <w:r>
+        <w:t>Kol başına tek deneme, kaydedilmemiş varyasyonlar ve eski protokol nedeniyle bu tabloyu genel bir RAG başarısı veya güncel normal üretim kıyası olarak sunmuyoruz. Güncel akış kaynak getirme, sağlayıcı ve backend toplam sürelerini; sağlayıcının bildirdiği girdi ve çıktı tokenlarını taşıyabiliyor. Bu süreler birbirini kapsadığı için toplanmamalı. Mobil uçtan uca süre, cache ve reasoning tokenları ile maliyet için kayıt yok. Güncel akışta kalıcı karşılaştırma arşivi de henüz oluşmadı.</w:t>
+      </w:r>
+    </w:p>
+    <w:p>
+      <w:r>
+        <w:t>Sonraki deneyde aynı model, aynı girdiler ve aynı üretim ayarlarıyla A/B/C kollarını tekrarlı çalıştırıp ham cevapları, istemleri, tokenları, süreleri ve hata/tekrar bilgilerini birlikte kaydedeceğiz. Kart kurallarına uyumu ayrıca değerlendireceğiz. Eski ölçümlerin kaynağı backend/logs/model_benchmarks.jsonl dosyasıdır; dosya Git tarafından izlenmediği için deney kayıtlarının depoda ayrıca korunması gerekiyor.</w:t>
       </w:r>
     </w:p>
     <w:sectPr>
@@ -914,7 +2169,7 @@
     <w:lsdException w:uiPriority="99" w:name="Normal Indent"/>
     <w:lsdException w:uiPriority="99" w:name="footnote text"/>
     <w:lsdException w:uiPriority="99" w:name="annotation text"/>
-    <w:lsdException w:uiPriority="99" w:semiHidden="0" w:name="header"/>
+    <w:lsdException w:qFormat="1" w:uiPriority="99" w:semiHidden="0" w:name="header"/>
     <w:lsdException w:qFormat="1" w:uiPriority="99" w:semiHidden="0" w:name="footer"/>
     <w:lsdException w:uiPriority="99" w:name="index heading"/>
     <w:lsdException w:qFormat="1" w:uiPriority="35" w:name="caption"/>
@@ -948,7 +2203,7 @@
     <w:lsdException w:qFormat="1" w:unhideWhenUsed="0" w:uiPriority="10" w:semiHidden="0" w:name="Title"/>
     <w:lsdException w:uiPriority="99" w:name="Closing"/>
     <w:lsdException w:uiPriority="99" w:name="Signature"/>
-    <w:lsdException w:uiPriority="1" w:name="Default Paragraph Font"/>
+    <w:lsdException w:qFormat="1" w:uiPriority="1" w:name="Default Paragraph Font"/>
     <w:lsdException w:uiPriority="99" w:semiHidden="0" w:name="Body Text"/>
     <w:lsdException w:uiPriority="99" w:name="Body Text Indent"/>
     <w:lsdException w:uiPriority="99" w:semiHidden="0" w:name="List Continue"/>
@@ -1051,19 +2306,19 @@
     <w:lsdException w:unhideWhenUsed="0" w:uiPriority="60" w:semiHidden="0" w:name="Light Shading Accent 1"/>
     <w:lsdException w:unhideWhenUsed="0" w:uiPriority="61" w:semiHidden="0" w:name="Light List Accent 1"/>
     <w:lsdException w:unhideWhenUsed="0" w:uiPriority="62" w:semiHidden="0" w:name="Light Grid Accent 1"/>
-    <w:lsdException w:qFormat="1" w:unhideWhenUsed="0" w:uiPriority="63" w:semiHidden="0" w:name="Medium Shading 1 Accent 1"/>
+    <w:lsdException w:unhideWhenUsed="0" w:uiPriority="63" w:semiHidden="0" w:name="Medium Shading 1 Accent 1"/>
     <w:lsdException w:unhideWhenUsed="0" w:uiPriority="64" w:semiHidden="0" w:name="Medium Shading 2 Accent 1"/>
     <w:lsdException w:unhideWhenUsed="0" w:uiPriority="65" w:semiHidden="0" w:name="Medium List 1 Accent 1"/>
     <w:lsdException w:qFormat="1" w:unhideWhenUsed="0" w:uiPriority="34" w:semiHidden="0" w:name="List Paragraph"/>
     <w:lsdException w:qFormat="1" w:unhideWhenUsed="0" w:uiPriority="29" w:semiHidden="0" w:name="Quote"/>
     <w:lsdException w:qFormat="1" w:unhideWhenUsed="0" w:uiPriority="30" w:semiHidden="0" w:name="Intense Quote"/>
-    <w:lsdException w:qFormat="1" w:unhideWhenUsed="0" w:uiPriority="66" w:semiHidden="0" w:name="Medium List 2 Accent 1"/>
-    <w:lsdException w:qFormat="1" w:unhideWhenUsed="0" w:uiPriority="67" w:semiHidden="0" w:name="Medium Grid 1 Accent 1"/>
+    <w:lsdException w:unhideWhenUsed="0" w:uiPriority="66" w:semiHidden="0" w:name="Medium List 2 Accent 1"/>
+    <w:lsdException w:unhideWhenUsed="0" w:uiPriority="67" w:semiHidden="0" w:name="Medium Grid 1 Accent 1"/>
     <w:lsdException w:unhideWhenUsed="0" w:uiPriority="68" w:semiHidden="0" w:name="Medium Grid 2 Accent 1"/>
     <w:lsdException w:unhideWhenUsed="0" w:uiPriority="69" w:semiHidden="0" w:name="Medium Grid 3 Accent 1"/>
     <w:lsdException w:unhideWhenUsed="0" w:uiPriority="70" w:semiHidden="0" w:name="Dark List Accent 1"/>
     <w:lsdException w:unhideWhenUsed="0" w:uiPriority="71" w:semiHidden="0" w:name="Colorful Shading Accent 1"/>
-    <w:lsdException w:unhideWhenUsed="0" w:uiPriority="72" w:semiHidden="0" w:name="Colorful List Accent 1"/>
+    <w:lsdException w:qFormat="1" w:unhideWhenUsed="0" w:uiPriority="72" w:semiHidden="0" w:name="Colorful List Accent 1"/>
     <w:lsdException w:unhideWhenUsed="0" w:uiPriority="73" w:semiHidden="0" w:name="Colorful Grid Accent 1"/>
     <w:lsdException w:unhideWhenUsed="0" w:uiPriority="60" w:semiHidden="0" w:name="Light Shading Accent 2"/>
     <w:lsdException w:unhideWhenUsed="0" w:uiPriority="61" w:semiHidden="0" w:name="Light List Accent 2"/>
@@ -1086,10 +2341,10 @@
     <w:lsdException w:unhideWhenUsed="0" w:uiPriority="64" w:semiHidden="0" w:name="Medium Shading 2 Accent 3"/>
     <w:lsdException w:unhideWhenUsed="0" w:uiPriority="65" w:semiHidden="0" w:name="Medium List 1 Accent 3"/>
     <w:lsdException w:unhideWhenUsed="0" w:uiPriority="66" w:semiHidden="0" w:name="Medium List 2 Accent 3"/>
-    <w:lsdException w:qFormat="1" w:unhideWhenUsed="0" w:uiPriority="67" w:semiHidden="0" w:name="Medium Grid 1 Accent 3"/>
+    <w:lsdException w:unhideWhenUsed="0" w:uiPriority="67" w:semiHidden="0" w:name="Medium Grid 1 Accent 3"/>
     <w:lsdException w:unhideWhenUsed="0" w:uiPriority="68" w:semiHidden="0" w:name="Medium Grid 2 Accent 3"/>
     <w:lsdException w:unhideWhenUsed="0" w:uiPriority="69" w:semiHidden="0" w:name="Medium Grid 3 Accent 3"/>
-    <w:lsdException w:unhideWhenUsed="0" w:uiPriority="70" w:semiHidden="0" w:name="Dark List Accent 3"/>
+    <w:lsdException w:qFormat="1" w:unhideWhenUsed="0" w:uiPriority="70" w:semiHidden="0" w:name="Dark List Accent 3"/>
     <w:lsdException w:unhideWhenUsed="0" w:uiPriority="71" w:semiHidden="0" w:name="Colorful Shading Accent 3"/>
     <w:lsdException w:unhideWhenUsed="0" w:uiPriority="72" w:semiHidden="0" w:name="Colorful List Accent 3"/>
     <w:lsdException w:unhideWhenUsed="0" w:uiPriority="73" w:semiHidden="0" w:name="Colorful Grid Accent 3"/>
@@ -1100,7 +2355,7 @@
     <w:lsdException w:unhideWhenUsed="0" w:uiPriority="64" w:semiHidden="0" w:name="Medium Shading 2 Accent 4"/>
     <w:lsdException w:unhideWhenUsed="0" w:uiPriority="65" w:semiHidden="0" w:name="Medium List 1 Accent 4"/>
     <w:lsdException w:unhideWhenUsed="0" w:uiPriority="66" w:semiHidden="0" w:name="Medium List 2 Accent 4"/>
-    <w:lsdException w:qFormat="1" w:unhideWhenUsed="0" w:uiPriority="67" w:semiHidden="0" w:name="Medium Grid 1 Accent 4"/>
+    <w:lsdException w:unhideWhenUsed="0" w:uiPriority="67" w:semiHidden="0" w:name="Medium Grid 1 Accent 4"/>
     <w:lsdException w:unhideWhenUsed="0" w:uiPriority="68" w:semiHidden="0" w:name="Medium Grid 2 Accent 4"/>
     <w:lsdException w:unhideWhenUsed="0" w:uiPriority="69" w:semiHidden="0" w:name="Medium Grid 3 Accent 4"/>
     <w:lsdException w:unhideWhenUsed="0" w:uiPriority="70" w:semiHidden="0" w:name="Dark List Accent 4"/>
@@ -1110,7 +2365,7 @@
     <w:lsdException w:unhideWhenUsed="0" w:uiPriority="60" w:semiHidden="0" w:name="Light Shading Accent 5"/>
     <w:lsdException w:unhideWhenUsed="0" w:uiPriority="61" w:semiHidden="0" w:name="Light List Accent 5"/>
     <w:lsdException w:unhideWhenUsed="0" w:uiPriority="62" w:semiHidden="0" w:name="Light Grid Accent 5"/>
-    <w:lsdException w:qFormat="1" w:unhideWhenUsed="0" w:uiPriority="63" w:semiHidden="0" w:name="Medium Shading 1 Accent 5"/>
+    <w:lsdException w:unhideWhenUsed="0" w:uiPriority="63" w:semiHidden="0" w:name="Medium Shading 1 Accent 5"/>
     <w:lsdException w:unhideWhenUsed="0" w:uiPriority="64" w:semiHidden="0" w:name="Medium Shading 2 Accent 5"/>
     <w:lsdException w:unhideWhenUsed="0" w:uiPriority="65" w:semiHidden="0" w:name="Medium List 1 Accent 5"/>
     <w:lsdException w:unhideWhenUsed="0" w:uiPriority="66" w:semiHidden="0" w:name="Medium List 2 Accent 5"/>
@@ -1132,7 +2387,7 @@
     <w:lsdException w:unhideWhenUsed="0" w:uiPriority="68" w:semiHidden="0" w:name="Medium Grid 2 Accent 6"/>
     <w:lsdException w:unhideWhenUsed="0" w:uiPriority="69" w:semiHidden="0" w:name="Medium Grid 3 Accent 6"/>
     <w:lsdException w:unhideWhenUsed="0" w:uiPriority="70" w:semiHidden="0" w:name="Dark List Accent 6"/>
-    <w:lsdException w:unhideWhenUsed="0" w:uiPriority="71" w:semiHidden="0" w:name="Colorful Shading Accent 6"/>
+    <w:lsdException w:qFormat="1" w:unhideWhenUsed="0" w:uiPriority="71" w:semiHidden="0" w:name="Colorful Shading Accent 6"/>
     <w:lsdException w:unhideWhenUsed="0" w:uiPriority="72" w:semiHidden="0" w:name="Colorful List Accent 6"/>
     <w:lsdException w:unhideWhenUsed="0" w:uiPriority="73" w:semiHidden="0" w:name="Colorful Grid Accent 6"/>
   </w:latentStyles>
@@ -1386,6 +2641,7 @@
     <w:name w:val="Default Paragraph Font"/>
     <w:semiHidden/>
     <w:unhideWhenUsed/>
+    <w:qFormat/>
     <w:uiPriority w:val="1"/>
   </w:style>
   <w:style w:type="table" w:default="1" w:styleId="12">
@@ -1490,6 +2746,7 @@
     <w:basedOn w:val="1"/>
     <w:link w:val="135"/>
     <w:unhideWhenUsed/>
+    <w:qFormat/>
     <w:uiPriority w:val="99"/>
     <w:pPr>
       <w:tabs>
@@ -4071,7 +5328,6 @@
   <w:style w:type="table" w:styleId="59">
     <w:name w:val="Medium Shading 1 Accent 1"/>
     <w:basedOn w:val="12"/>
-    <w:qFormat/>
     <w:uiPriority w:val="63"/>
     <w:pPr>
       <w:spacing w:after="0" w:line="240" w:lineRule="auto"/>
@@ -4500,7 +5756,6 @@
   <w:style w:type="table" w:styleId="63">
     <w:name w:val="Medium Shading 1 Accent 5"/>
     <w:basedOn w:val="12"/>
-    <w:qFormat/>
     <w:uiPriority w:val="63"/>
     <w:pPr>
       <w:spacing w:after="0" w:line="240" w:lineRule="auto"/>
@@ -6629,7 +7884,6 @@
   <w:style w:type="table" w:styleId="80">
     <w:name w:val="Medium List 2 Accent 1"/>
     <w:basedOn w:val="12"/>
-    <w:qFormat/>
     <w:uiPriority w:val="66"/>
     <w:pPr>
       <w:spacing w:after="0" w:line="240" w:lineRule="auto"/>
@@ -7473,7 +8727,6 @@
   <w:style w:type="table" w:styleId="87">
     <w:name w:val="Medium Grid 1 Accent 1"/>
     <w:basedOn w:val="12"/>
-    <w:qFormat/>
     <w:uiPriority w:val="67"/>
     <w:pPr>
       <w:spacing w:after="0" w:line="240" w:lineRule="auto"/>
@@ -7612,7 +8865,6 @@
   <w:style w:type="table" w:styleId="89">
     <w:name w:val="Medium Grid 1 Accent 3"/>
     <w:basedOn w:val="12"/>
-    <w:qFormat/>
     <w:uiPriority w:val="67"/>
     <w:pPr>
       <w:spacing w:after="0" w:line="240" w:lineRule="auto"/>
@@ -7682,7 +8934,6 @@
   <w:style w:type="table" w:styleId="90">
     <w:name w:val="Medium Grid 1 Accent 4"/>
     <w:basedOn w:val="12"/>
-    <w:qFormat/>
     <w:uiPriority w:val="67"/>
     <w:pPr>
       <w:spacing w:after="0" w:line="240" w:lineRule="auto"/>
@@ -10356,6 +11607,7 @@
   <w:style w:type="table" w:styleId="110">
     <w:name w:val="Dark List Accent 3"/>
     <w:basedOn w:val="12"/>
+    <w:qFormat/>
     <w:uiPriority w:val="70"/>
     <w:pPr>
       <w:spacing w:after="0" w:line="240" w:lineRule="auto"/>
@@ -11684,6 +12936,7 @@
   <w:style w:type="table" w:styleId="120">
     <w:name w:val="Colorful Shading Accent 6"/>
     <w:basedOn w:val="12"/>
+    <w:qFormat/>
     <w:uiPriority w:val="71"/>
     <w:pPr>
       <w:spacing w:after="0" w:line="240" w:lineRule="auto"/>
@@ -11924,6 +13177,7 @@
   <w:style w:type="table" w:styleId="122">
     <w:name w:val="Colorful List Accent 1"/>
     <w:basedOn w:val="12"/>
+    <w:qFormat/>
     <w:uiPriority w:val="72"/>
     <w:pPr>
       <w:spacing w:after="0" w:line="240" w:lineRule="auto"/>
@@ -13149,7 +14403,6 @@
     <w:name w:val="Header Char"/>
     <w:basedOn w:val="11"/>
     <w:link w:val="19"/>
-    <w:qFormat/>
     <w:uiPriority w:val="99"/>
   </w:style>
   <w:style w:type="character" w:customStyle="1" w:styleId="136">

</xml_diff>